<commit_message>
Use stable Zenodo concept DOI
</commit_message>
<xml_diff>
--- a/manuscript/Applied_Sciences_Manuscript.docx
+++ b/manuscript/Applied_Sciences_Manuscript.docx
@@ -826,17 +826,11 @@
         <w:pStyle w:val="MDPI31text"/>
       </w:pPr>
       <w:r>
-        <w:t>Robustness analyses excluded penalties, added time, and set pieces; used metric-corrected geometry; removed situation-derived predictors; and used reduced profile matrices. Analyses were conducted in Python using pandas, NumPy, scikit-learn, CatBoost, statsmodels, SciPy, and related open-source packages. Analysis code and derived analytical outputs are archived on Zenodo at https://zenodo.org/records/</w:t>
+        <w:t>Robustness analyses excluded penalties, added time, and set pieces; used metric-corrected geometry; removed situation-derived predictors; and used reduced profile matrices. Analyses were conducted in Python using pandas, NumPy, scikit-learn, CatBoost, statsmodels, SciPy, and related open-source packages. Analysis code and derived analytical outputs are archived on Zenodo at https://doi.org/10.5281/zenodo.22540653.</w:t>
       </w:r>
-      <w:r>
-        <w:t xml:space="preserve"> </w:t>
-      </w:r>
-      <w:r>
-        <w:t>22876916</w:t>
-      </w:r>
-      <w:r>
-        <w:t>.</w:t>
-      </w:r>
+      <w:r/>
+      <w:r/>
+      <w:r/>
     </w:p>
     <w:p>
       <w:pPr>
@@ -14583,7 +14577,7 @@
         <w:pStyle w:val="MDPI62backmatter"/>
       </w:pPr>
       <w:r>
-        <w:t>Data Availability Statement: Analysis code and derived analytical outputs are publicly available on Zenodo at https://zenodo.org/records/22535919. Raw provider-derived match-centre and shot-map records are not redistributed.</w:t>
+        <w:t>Data Availability Statement: Analysis code and derived analytical outputs are publicly available on Zenodo at https://doi.org/10.5281/zenodo.22540653. Raw provider-derived match-centre and shot-map records are not redistributed.</w:t>
       </w:r>
     </w:p>
     <w:p>

</xml_diff>